<commit_message>
Blocos de codigo renderizados como imagem, no estilo do Carbon
scripts/lib/realce.js  - tokenizador proprio (csharp, ts/js, python, cpp/ino,
                         sql, bash), sem dependencia externa
scripts/lib/codigo.js  - renderiza no Chrome headless que ja servia ao mermaid:
                         janela com barra, cantos arredondados, sombra, numero
                         de linha e rotulo da linguagem
relatorio.js           - passagem que troca cada bloco pela imagem, depois do
                         mermaid para nao capturar os blocos de diagrama
docx.js                - caixa com borda e realce colorido como fallback quando
                         o Chrome falha ou o bloco passa de 60 linhas

Configuravel em config.json: tema claro ou escuro, numeracao, largura maxima.

Co-Authored-By: Claude Opus 5 <noreply@anthropic.com>
</commit_message>
<xml_diff>
--- a/entregas/Arquitetura de Software 2/Tarefa Semana 06/entrega/Tarefa Semana 06 - Arquitetura de Software 2.docx
+++ b/entregas/Arquitetura de Software 2/Tarefa Semana 06/entrega/Tarefa Semana 06 - Arquitetura de Software 2.docx
@@ -1475,90 +1475,117 @@
         <w:t xml:space="preserve">, feita pela camada de Query.</w:t>
       </w:r>
     </w:p>
-    <w:p>
-      <w:pPr>
-        <w:spacing w:after="0" w:before="40" w:line="240" w:lineRule="auto"/>
-        <w:ind w:firstLine="0" w:start="200"/>
-        <w:jc w:val="start"/>
-        <w:shd w:val="clear" w:fill="F5F5F5"/>
-      </w:pPr>
-      <w:r>
-        <w:rPr>
-          <w:rFonts w:ascii="Consolas" w:hAnsi="Consolas" w:cs="Consolas" w:eastAsia="Consolas"/>
-          <w:color w:val="000000"/>
-          <w:sz w:val="19"/>
-          <w:szCs w:val="19"/>
-        </w:rPr>
-        <w:t xml:space="preserve">        falhas &gt; 50% em 30 s</w:t>
-      </w:r>
-    </w:p>
-    <w:p>
-      <w:pPr>
-        <w:spacing w:after="0" w:before="0" w:line="240" w:lineRule="auto"/>
-        <w:ind w:firstLine="0" w:start="200"/>
-        <w:jc w:val="start"/>
-        <w:shd w:val="clear" w:fill="F5F5F5"/>
-      </w:pPr>
-      <w:r>
-        <w:rPr>
-          <w:rFonts w:ascii="Consolas" w:hAnsi="Consolas" w:cs="Consolas" w:eastAsia="Consolas"/>
-          <w:color w:val="000000"/>
-          <w:sz w:val="19"/>
-          <w:szCs w:val="19"/>
-        </w:rPr>
-        <w:t xml:space="preserve">FECHADO ─────────────────────────► ABERTO</w:t>
-      </w:r>
-    </w:p>
-    <w:p>
-      <w:pPr>
-        <w:spacing w:after="0" w:before="0" w:line="240" w:lineRule="auto"/>
-        <w:ind w:firstLine="0" w:start="200"/>
-        <w:jc w:val="start"/>
-        <w:shd w:val="clear" w:fill="F5F5F5"/>
-      </w:pPr>
-      <w:r>
-        <w:rPr>
-          <w:rFonts w:ascii="Consolas" w:hAnsi="Consolas" w:cs="Consolas" w:eastAsia="Consolas"/>
-          <w:color w:val="000000"/>
-          <w:sz w:val="19"/>
-          <w:szCs w:val="19"/>
-        </w:rPr>
-        <w:t xml:space="preserve">   ▲                                  │</w:t>
-      </w:r>
-    </w:p>
-    <w:p>
-      <w:pPr>
-        <w:spacing w:after="0" w:before="0" w:line="240" w:lineRule="auto"/>
-        <w:ind w:firstLine="0" w:start="200"/>
-        <w:jc w:val="start"/>
-        <w:shd w:val="clear" w:fill="F5F5F5"/>
-      </w:pPr>
-      <w:r>
-        <w:rPr>
-          <w:rFonts w:ascii="Consolas" w:hAnsi="Consolas" w:cs="Consolas" w:eastAsia="Consolas"/>
-          <w:color w:val="000000"/>
-          <w:sz w:val="19"/>
-          <w:szCs w:val="19"/>
-        </w:rPr>
-        <w:t xml:space="preserve">   │  1 chamada de teste OK           │ após 60 s</w:t>
-      </w:r>
-    </w:p>
-    <w:p>
-      <w:pPr>
-        <w:spacing w:after="120" w:before="0" w:line="240" w:lineRule="auto"/>
-        <w:ind w:firstLine="0" w:start="200"/>
-        <w:jc w:val="start"/>
-        <w:shd w:val="clear" w:fill="F5F5F5"/>
-      </w:pPr>
-      <w:r>
-        <w:rPr>
-          <w:rFonts w:ascii="Consolas" w:hAnsi="Consolas" w:cs="Consolas" w:eastAsia="Consolas"/>
-          <w:color w:val="000000"/>
-          <w:sz w:val="19"/>
-          <w:szCs w:val="19"/>
-        </w:rPr>
-        <w:t xml:space="preserve">   └────────── MEIO-ABERTO ◄──────────┘</w:t>
-      </w:r>
+    <w:tbl>
+      <w:tblPr>
+        <w:tblW w:w="5000" w:type="pct"/>
+        <w:tblBorders>
+          <w:top w:val="single" w:sz="4" w:space="0" w:color="D8DEE4"/>
+          <w:left w:val="single" w:sz="4" w:space="0" w:color="D8DEE4"/>
+          <w:bottom w:val="single" w:sz="4" w:space="0" w:color="D8DEE4"/>
+          <w:right w:val="single" w:sz="4" w:space="0" w:color="D8DEE4"/>
+        </w:tblBorders>
+        <w:tblCellMar>
+          <w:top w:w="80" w:type="dxa"/>
+          <w:left w:w="140" w:type="dxa"/>
+          <w:bottom w:w="80" w:type="dxa"/>
+          <w:right w:w="140" w:type="dxa"/>
+        </w:tblCellMar>
+      </w:tblPr>
+      <w:tr>
+        <w:tc>
+          <w:tcPr>
+            <w:tcW w:w="5000" w:type="pct"/>
+            <w:shd w:val="clear" w:fill="F6F8FA"/>
+          </w:tcPr>
+          <w:p>
+            <w:pPr>
+              <w:spacing w:after="0" w:before="40" w:line="240" w:lineRule="auto"/>
+              <w:ind w:firstLine="0" w:start="0"/>
+              <w:jc w:val="start"/>
+            </w:pPr>
+            <w:r>
+              <w:rPr>
+                <w:rFonts w:ascii="Consolas" w:hAnsi="Consolas" w:cs="Consolas" w:eastAsia="Consolas"/>
+                <w:color w:val="1F2328"/>
+                <w:sz w:val="18"/>
+                <w:szCs w:val="18"/>
+              </w:rPr>
+              <w:t xml:space="preserve">        falhas &gt; 50% em 30 s</w:t>
+            </w:r>
+          </w:p>
+          <w:p>
+            <w:pPr>
+              <w:spacing w:after="0" w:before="0" w:line="240" w:lineRule="auto"/>
+              <w:ind w:firstLine="0" w:start="0"/>
+              <w:jc w:val="start"/>
+            </w:pPr>
+            <w:r>
+              <w:rPr>
+                <w:rFonts w:ascii="Consolas" w:hAnsi="Consolas" w:cs="Consolas" w:eastAsia="Consolas"/>
+                <w:color w:val="1F2328"/>
+                <w:sz w:val="18"/>
+                <w:szCs w:val="18"/>
+              </w:rPr>
+              <w:t xml:space="preserve">FECHADO ─────────────────────────► ABERTO</w:t>
+            </w:r>
+          </w:p>
+          <w:p>
+            <w:pPr>
+              <w:spacing w:after="0" w:before="0" w:line="240" w:lineRule="auto"/>
+              <w:ind w:firstLine="0" w:start="0"/>
+              <w:jc w:val="start"/>
+            </w:pPr>
+            <w:r>
+              <w:rPr>
+                <w:rFonts w:ascii="Consolas" w:hAnsi="Consolas" w:cs="Consolas" w:eastAsia="Consolas"/>
+                <w:color w:val="1F2328"/>
+                <w:sz w:val="18"/>
+                <w:szCs w:val="18"/>
+              </w:rPr>
+              <w:t xml:space="preserve">   ▲                                  │</w:t>
+            </w:r>
+          </w:p>
+          <w:p>
+            <w:pPr>
+              <w:spacing w:after="0" w:before="0" w:line="240" w:lineRule="auto"/>
+              <w:ind w:firstLine="0" w:start="0"/>
+              <w:jc w:val="start"/>
+            </w:pPr>
+            <w:r>
+              <w:rPr>
+                <w:rFonts w:ascii="Consolas" w:hAnsi="Consolas" w:cs="Consolas" w:eastAsia="Consolas"/>
+                <w:color w:val="1F2328"/>
+                <w:sz w:val="18"/>
+                <w:szCs w:val="18"/>
+              </w:rPr>
+              <w:t xml:space="preserve">   │  1 chamada de teste OK           │ após 60 s</w:t>
+            </w:r>
+          </w:p>
+          <w:p>
+            <w:pPr>
+              <w:spacing w:after="0" w:before="0" w:line="240" w:lineRule="auto"/>
+              <w:ind w:firstLine="0" w:start="0"/>
+              <w:jc w:val="start"/>
+            </w:pPr>
+            <w:r>
+              <w:rPr>
+                <w:rFonts w:ascii="Consolas" w:hAnsi="Consolas" w:cs="Consolas" w:eastAsia="Consolas"/>
+                <w:color w:val="1F2328"/>
+                <w:sz w:val="18"/>
+                <w:szCs w:val="18"/>
+              </w:rPr>
+              <w:t xml:space="preserve">   └────────── MEIO-ABERTO ◄──────────┘</w:t>
+            </w:r>
+          </w:p>
+        </w:tc>
+      </w:tr>
+    </w:tbl>
+    <w:p>
+      <w:pPr>
+        <w:spacing w:after="60" w:before="0" w:line="276" w:lineRule="auto"/>
+        <w:ind w:firstLine="0" w:start="0"/>
+        <w:jc w:val="start"/>
+      </w:pPr>
     </w:p>
     <w:p>
       <w:pPr>

</xml_diff>